<commit_message>
add relative error and modify paper
</commit_message>
<xml_diff>
--- a/Linear system/hw4.docx
+++ b/Linear system/hw4.docx
@@ -109,7 +109,7 @@
           <v:shape id="_x0000_i1025" type="#_x0000_t75" style="width:153pt;height:33.75pt" o:ole="">
             <v:imagedata r:id="rId5" o:title=""/>
           </v:shape>
-          <o:OLEObject Type="Embed" ProgID="Equation.3" ShapeID="_x0000_i1025" DrawAspect="Content" ObjectID="_1826710450" r:id="rId6"/>
+          <o:OLEObject Type="Embed" ProgID="Equation.3" ShapeID="_x0000_i1025" DrawAspect="Content" ObjectID="_1826719268" r:id="rId6"/>
         </w:object>
       </w:r>
     </w:p>
@@ -145,7 +145,7 @@
           <v:shape id="_x0000_i1026" type="#_x0000_t75" style="width:207pt;height:18pt" o:ole="">
             <v:imagedata r:id="rId7" o:title=""/>
           </v:shape>
-          <o:OLEObject Type="Embed" ProgID="Equation.3" ShapeID="_x0000_i1026" DrawAspect="Content" ObjectID="_1826710451" r:id="rId8"/>
+          <o:OLEObject Type="Embed" ProgID="Equation.3" ShapeID="_x0000_i1026" DrawAspect="Content" ObjectID="_1826719269" r:id="rId8"/>
         </w:object>
       </w:r>
     </w:p>
@@ -193,7 +193,7 @@
           <v:shape id="_x0000_i1027" type="#_x0000_t75" style="width:152.25pt;height:38.25pt" o:ole="">
             <v:imagedata r:id="rId9" o:title=""/>
           </v:shape>
-          <o:OLEObject Type="Embed" ProgID="Equation.3" ShapeID="_x0000_i1027" DrawAspect="Content" ObjectID="_1826710452" r:id="rId10"/>
+          <o:OLEObject Type="Embed" ProgID="Equation.3" ShapeID="_x0000_i1027" DrawAspect="Content" ObjectID="_1826719270" r:id="rId10"/>
         </w:object>
       </w:r>
     </w:p>
@@ -235,7 +235,7 @@
           <v:shape id="_x0000_i1028" type="#_x0000_t75" style="width:192.75pt;height:75.75pt" o:ole="">
             <v:imagedata r:id="rId11" o:title=""/>
           </v:shape>
-          <o:OLEObject Type="Embed" ProgID="Equation.3" ShapeID="_x0000_i1028" DrawAspect="Content" ObjectID="_1826710453" r:id="rId12"/>
+          <o:OLEObject Type="Embed" ProgID="Equation.3" ShapeID="_x0000_i1028" DrawAspect="Content" ObjectID="_1826719271" r:id="rId12"/>
         </w:object>
       </w:r>
     </w:p>
@@ -331,7 +331,7 @@
           <v:shape id="_x0000_i1029" type="#_x0000_t75" style="width:63pt;height:17.25pt" o:ole="">
             <v:imagedata r:id="rId13" o:title=""/>
           </v:shape>
-          <o:OLEObject Type="Embed" ProgID="Equation.3" ShapeID="_x0000_i1029" DrawAspect="Content" ObjectID="_1826710454" r:id="rId14"/>
+          <o:OLEObject Type="Embed" ProgID="Equation.3" ShapeID="_x0000_i1029" DrawAspect="Content" ObjectID="_1826719272" r:id="rId14"/>
         </w:object>
       </w:r>
     </w:p>
@@ -1138,31 +1138,7 @@
               <w:rPr>
                 <w:rFonts w:hint="eastAsia"/>
               </w:rPr>
-              <w:t>圖</w:t>
-            </w:r>
-            <w:r>
-              <w:rPr>
-                <w:rFonts w:hint="eastAsia"/>
-              </w:rPr>
-              <w:t>四</w:t>
-            </w:r>
-            <w:r>
-              <w:rPr>
-                <w:rFonts w:hint="eastAsia"/>
-              </w:rPr>
-              <w:t>：</w:t>
-            </w:r>
-            <w:r>
-              <w:rPr>
-                <w:rFonts w:hint="eastAsia"/>
-              </w:rPr>
-              <w:t>五次</w:t>
-            </w:r>
-            <w:r>
-              <w:rPr>
-                <w:rFonts w:hint="eastAsia"/>
-              </w:rPr>
-              <w:t>多項式函數</w:t>
+              <w:t>圖四：五次多項式函數</w:t>
             </w:r>
             <w:r>
               <w:rPr>
@@ -1187,7 +1163,7 @@
               <w:rPr>
                 <w:rFonts w:hint="eastAsia"/>
               </w:rPr>
-              <w:t>圖</w:t>
+              <w:t>圖五：</w:t>
             </w:r>
             <w:r>
               <w:rPr>
@@ -1199,25 +1175,7 @@
               <w:rPr>
                 <w:rFonts w:hint="eastAsia"/>
               </w:rPr>
-              <w:t>：</w:t>
-            </w:r>
-            <w:r>
-              <w:rPr>
-                <w:rFonts w:hint="eastAsia"/>
-              </w:rPr>
-              <w:t>五</w:t>
-            </w:r>
-            <w:r>
-              <w:rPr>
-                <w:rFonts w:hint="eastAsia"/>
-              </w:rPr>
-              <w:t>次</w:t>
-            </w:r>
-            <w:r>
-              <w:rPr>
-                <w:rFonts w:hint="eastAsia"/>
-              </w:rPr>
-              <w:t>多項式函數</w:t>
+              <w:t>次多項式函數</w:t>
             </w:r>
             <w:r>
               <w:rPr>
@@ -1311,30 +1269,13 @@
               <w:rPr>
                 <w:rFonts w:hint="eastAsia"/>
               </w:rPr>
-              <w:t>圖</w:t>
-            </w:r>
-            <w:r>
-              <w:rPr>
-                <w:rFonts w:hint="eastAsia"/>
-              </w:rPr>
-              <w:t>六</w:t>
-            </w:r>
-            <w:r>
-              <w:rPr>
-                <w:rFonts w:hint="eastAsia"/>
-              </w:rPr>
-              <w:t>：兩函數所構成之圓</w:t>
+              <w:t>圖六：兩函數所構成之圓</w:t>
             </w:r>
           </w:p>
         </w:tc>
       </w:tr>
     </w:tbl>
     <w:p>
-      <w:pPr>
-        <w:rPr>
-          <w:rFonts w:hint="eastAsia"/>
-        </w:rPr>
-      </w:pPr>
       <w:r>
         <w:tab/>
       </w:r>
@@ -1418,7 +1359,19 @@
         <w:rPr>
           <w:rFonts w:hint="eastAsia"/>
         </w:rPr>
-        <w:t>分解在原系統的誤差：</w:t>
+        <w:t>分解在原系統的</w:t>
+      </w:r>
+      <w:r>
+        <w:rPr>
+          <w:rFonts w:hint="eastAsia"/>
+        </w:rPr>
+        <w:t>絕對</w:t>
+      </w:r>
+      <w:r>
+        <w:rPr>
+          <w:rFonts w:hint="eastAsia"/>
+        </w:rPr>
+        <w:t>誤差：</w:t>
       </w:r>
     </w:p>
     <w:tbl>
@@ -1581,7 +1534,7 @@
               <w:rPr>
                 <w:rFonts w:hint="eastAsia"/>
               </w:rPr>
-              <w:t>表一</w:t>
+              <w:t>圖七</w:t>
             </w:r>
             <w:r>
               <w:rPr>
@@ -1624,7 +1577,7 @@
               <w:rPr>
                 <w:rFonts w:hint="eastAsia"/>
               </w:rPr>
-              <w:t>表二</w:t>
+              <w:t>圖八</w:t>
             </w:r>
             <w:r>
               <w:rPr>
@@ -1797,7 +1750,7 @@
               <w:rPr>
                 <w:rFonts w:hint="eastAsia"/>
               </w:rPr>
-              <w:t>表三</w:t>
+              <w:t>圖九</w:t>
             </w:r>
             <w:r>
               <w:rPr>
@@ -1840,7 +1793,7 @@
               <w:rPr>
                 <w:rFonts w:hint="eastAsia"/>
               </w:rPr>
-              <w:t>表四</w:t>
+              <w:t>圖十</w:t>
             </w:r>
             <w:r>
               <w:rPr>
@@ -1888,7 +1841,19 @@
         <w:rPr>
           <w:rFonts w:hint="eastAsia"/>
         </w:rPr>
-        <w:t>由上圖可看出不論哪種方法，誤差在剛開始都有隨著多項式次數慢慢上升而慢慢下降，且三種方法的誤差相近。</w:t>
+        <w:t>由上</w:t>
+      </w:r>
+      <w:r>
+        <w:rPr>
+          <w:rFonts w:hint="eastAsia"/>
+        </w:rPr>
+        <w:t>圖</w:t>
+      </w:r>
+      <w:r>
+        <w:rPr>
+          <w:rFonts w:hint="eastAsia"/>
+        </w:rPr>
+        <w:t>可看出不論哪種方法，誤差在剛開始都有隨著多項式次數慢慢上升而慢慢下降，且三種方法的誤差相近。</w:t>
       </w:r>
     </w:p>
     <w:p>
@@ -2085,11 +2050,9 @@
         </w:rPr>
         <w:t>矩陣是</w:t>
       </w:r>
-      <w:proofErr w:type="spellStart"/>
       <w:r>
         <w:t>Vandermonde</w:t>
       </w:r>
-      <w:proofErr w:type="spellEnd"/>
       <w:r>
         <w:rPr>
           <w:rFonts w:hint="eastAsia"/>
@@ -2189,13 +2152,742 @@
         <w:widowControl/>
         <w:ind w:firstLine="480"/>
       </w:pPr>
+      <w:r>
+        <w:rPr>
+          <w:rFonts w:hint="eastAsia"/>
+        </w:rPr>
+        <w:t>接下來是相對誤差，不過在計算相對誤差的時候發現取樣點從</w:t>
+      </w:r>
+      <w:r>
+        <w:rPr>
+          <w:rFonts w:hint="eastAsia"/>
+        </w:rPr>
+        <w:t>0</w:t>
+      </w:r>
+      <w:r>
+        <w:rPr>
+          <w:rFonts w:hint="eastAsia"/>
+        </w:rPr>
+        <w:t>開始</w:t>
+      </w:r>
+      <w:r>
+        <w:rPr>
+          <w:rFonts w:hint="eastAsia"/>
+        </w:rPr>
+        <w:t>y</w:t>
+      </w:r>
+      <w:r>
+        <w:rPr>
+          <w:rFonts w:hint="eastAsia"/>
+        </w:rPr>
+        <w:t>函數會無法估計，因為在相對誤差會除上</w:t>
+      </w:r>
+      <w:r>
+        <w:rPr>
+          <w:rFonts w:hint="eastAsia"/>
+        </w:rPr>
+        <w:t>y</w:t>
+      </w:r>
+      <w:r>
+        <w:t>(0)</w:t>
+      </w:r>
+      <w:r>
+        <w:rPr>
+          <w:rFonts w:hint="eastAsia"/>
+        </w:rPr>
+        <w:t>，而</w:t>
+      </w:r>
+      <w:r>
+        <w:rPr>
+          <w:rFonts w:hint="eastAsia"/>
+        </w:rPr>
+        <w:t>y</w:t>
+      </w:r>
+      <w:r>
+        <w:rPr>
+          <w:rFonts w:hint="eastAsia"/>
+        </w:rPr>
+        <w:t>是</w:t>
+      </w:r>
+      <w:r>
+        <w:rPr>
+          <w:rFonts w:hint="eastAsia"/>
+        </w:rPr>
+        <w:t>s</w:t>
+      </w:r>
+      <w:r>
+        <w:t>in</w:t>
+      </w:r>
+      <w:r>
+        <w:rPr>
+          <w:rFonts w:hint="eastAsia"/>
+        </w:rPr>
+        <w:t>函數，其在</w:t>
+      </w:r>
+      <w:r>
+        <w:rPr>
+          <w:rFonts w:hint="eastAsia"/>
+        </w:rPr>
+        <w:t>0</w:t>
+      </w:r>
+      <w:r>
+        <w:rPr>
+          <w:rFonts w:hint="eastAsia"/>
+        </w:rPr>
+        <w:t>時函數值也為</w:t>
+      </w:r>
+      <w:r>
+        <w:rPr>
+          <w:rFonts w:hint="eastAsia"/>
+        </w:rPr>
+        <w:t>0</w:t>
+      </w:r>
+      <w:r>
+        <w:rPr>
+          <w:rFonts w:hint="eastAsia"/>
+        </w:rPr>
+        <w:t>，因此我將取樣點增加了些許偏移量</w:t>
+      </w:r>
+      <w:r>
+        <w:rPr>
+          <w:rFonts w:hint="eastAsia"/>
+        </w:rPr>
+        <w:t>。以</w:t>
+      </w:r>
+      <w:r>
+        <w:rPr>
+          <w:rFonts w:hint="eastAsia"/>
+        </w:rPr>
+        <w:t>y</w:t>
+      </w:r>
+      <w:r>
+        <w:rPr>
+          <w:rFonts w:hint="eastAsia"/>
+        </w:rPr>
+        <w:t>為主，</w:t>
+      </w:r>
+      <w:r>
+        <w:rPr>
+          <w:rFonts w:hint="eastAsia"/>
+        </w:rPr>
+        <w:t>不同偏移量出來的結果如下圖所示：</w:t>
+      </w:r>
+    </w:p>
+    <w:tbl>
+      <w:tblPr>
+        <w:tblStyle w:val="a4"/>
+        <w:tblW w:w="0" w:type="auto"/>
+        <w:tblBorders>
+          <w:top w:val="none" w:sz="0" w:space="0" w:color="auto"/>
+          <w:left w:val="none" w:sz="0" w:space="0" w:color="auto"/>
+          <w:bottom w:val="none" w:sz="0" w:space="0" w:color="auto"/>
+          <w:right w:val="none" w:sz="0" w:space="0" w:color="auto"/>
+          <w:insideH w:val="none" w:sz="0" w:space="0" w:color="auto"/>
+          <w:insideV w:val="none" w:sz="0" w:space="0" w:color="auto"/>
+        </w:tblBorders>
+        <w:tblLook w:val="04A0" w:firstRow="1" w:lastRow="0" w:firstColumn="1" w:lastColumn="0" w:noHBand="0" w:noVBand="1"/>
+      </w:tblPr>
+      <w:tblGrid>
+        <w:gridCol w:w="4153"/>
+        <w:gridCol w:w="4153"/>
+      </w:tblGrid>
+      <w:tr>
+        <w:tc>
+          <w:tcPr>
+            <w:tcW w:w="4148" w:type="dxa"/>
+          </w:tcPr>
+          <w:p>
+            <w:pPr>
+              <w:widowControl/>
+              <w:rPr>
+                <w:rFonts w:hint="eastAsia"/>
+                <w:noProof/>
+              </w:rPr>
+            </w:pPr>
+            <w:r>
+              <w:rPr>
+                <w:rFonts w:hint="eastAsia"/>
+                <w:noProof/>
+              </w:rPr>
+              <w:lastRenderedPageBreak/>
+              <w:drawing>
+                <wp:inline distT="0" distB="0" distL="0" distR="0" wp14:anchorId="04A3612D" wp14:editId="5B640D4E">
+                  <wp:extent cx="2566453" cy="1926000"/>
+                  <wp:effectExtent l="0" t="0" r="5715" b="0"/>
+                  <wp:docPr id="12" name="圖片 12"/>
+                  <wp:cNvGraphicFramePr>
+                    <a:graphicFrameLocks xmlns:a="http://schemas.openxmlformats.org/drawingml/2006/main" noChangeAspect="1"/>
+                  </wp:cNvGraphicFramePr>
+                  <a:graphic xmlns:a="http://schemas.openxmlformats.org/drawingml/2006/main">
+                    <a:graphicData uri="http://schemas.openxmlformats.org/drawingml/2006/picture">
+                      <pic:pic xmlns:pic="http://schemas.openxmlformats.org/drawingml/2006/picture">
+                        <pic:nvPicPr>
+                          <pic:cNvPr id="0" name="Picture 8"/>
+                          <pic:cNvPicPr>
+                            <a:picLocks noChangeAspect="1" noChangeArrowheads="1"/>
+                          </pic:cNvPicPr>
+                        </pic:nvPicPr>
+                        <pic:blipFill>
+                          <a:blip r:embed="rId25" cstate="print">
+                            <a:extLst>
+                              <a:ext uri="{28A0092B-C50C-407E-A947-70E740481C1C}">
+                                <a14:useLocalDpi xmlns:a14="http://schemas.microsoft.com/office/drawing/2010/main" val="0"/>
+                              </a:ext>
+                            </a:extLst>
+                          </a:blip>
+                          <a:srcRect/>
+                          <a:stretch>
+                            <a:fillRect/>
+                          </a:stretch>
+                        </pic:blipFill>
+                        <pic:spPr bwMode="auto">
+                          <a:xfrm>
+                            <a:off x="0" y="0"/>
+                            <a:ext cx="2566453" cy="1926000"/>
+                          </a:xfrm>
+                          <a:prstGeom prst="rect">
+                            <a:avLst/>
+                          </a:prstGeom>
+                          <a:noFill/>
+                          <a:ln>
+                            <a:noFill/>
+                          </a:ln>
+                        </pic:spPr>
+                      </pic:pic>
+                    </a:graphicData>
+                  </a:graphic>
+                </wp:inline>
+              </w:drawing>
+            </w:r>
+          </w:p>
+        </w:tc>
+        <w:tc>
+          <w:tcPr>
+            <w:tcW w:w="4148" w:type="dxa"/>
+          </w:tcPr>
+          <w:p>
+            <w:pPr>
+              <w:widowControl/>
+              <w:rPr>
+                <w:rFonts w:hint="eastAsia"/>
+                <w:noProof/>
+              </w:rPr>
+            </w:pPr>
+            <w:r>
+              <w:rPr>
+                <w:rFonts w:hint="eastAsia"/>
+                <w:noProof/>
+              </w:rPr>
+              <w:drawing>
+                <wp:inline distT="0" distB="0" distL="0" distR="0" wp14:anchorId="5E1E3A58" wp14:editId="04CA601E">
+                  <wp:extent cx="2566453" cy="1926000"/>
+                  <wp:effectExtent l="0" t="0" r="5715" b="0"/>
+                  <wp:docPr id="14" name="圖片 14"/>
+                  <wp:cNvGraphicFramePr>
+                    <a:graphicFrameLocks xmlns:a="http://schemas.openxmlformats.org/drawingml/2006/main" noChangeAspect="1"/>
+                  </wp:cNvGraphicFramePr>
+                  <a:graphic xmlns:a="http://schemas.openxmlformats.org/drawingml/2006/main">
+                    <a:graphicData uri="http://schemas.openxmlformats.org/drawingml/2006/picture">
+                      <pic:pic xmlns:pic="http://schemas.openxmlformats.org/drawingml/2006/picture">
+                        <pic:nvPicPr>
+                          <pic:cNvPr id="0" name="Picture 9"/>
+                          <pic:cNvPicPr>
+                            <a:picLocks noChangeAspect="1" noChangeArrowheads="1"/>
+                          </pic:cNvPicPr>
+                        </pic:nvPicPr>
+                        <pic:blipFill>
+                          <a:blip r:embed="rId26" cstate="print">
+                            <a:extLst>
+                              <a:ext uri="{28A0092B-C50C-407E-A947-70E740481C1C}">
+                                <a14:useLocalDpi xmlns:a14="http://schemas.microsoft.com/office/drawing/2010/main" val="0"/>
+                              </a:ext>
+                            </a:extLst>
+                          </a:blip>
+                          <a:srcRect/>
+                          <a:stretch>
+                            <a:fillRect/>
+                          </a:stretch>
+                        </pic:blipFill>
+                        <pic:spPr bwMode="auto">
+                          <a:xfrm>
+                            <a:off x="0" y="0"/>
+                            <a:ext cx="2566453" cy="1926000"/>
+                          </a:xfrm>
+                          <a:prstGeom prst="rect">
+                            <a:avLst/>
+                          </a:prstGeom>
+                          <a:noFill/>
+                          <a:ln>
+                            <a:noFill/>
+                          </a:ln>
+                        </pic:spPr>
+                      </pic:pic>
+                    </a:graphicData>
+                  </a:graphic>
+                </wp:inline>
+              </w:drawing>
+            </w:r>
+          </w:p>
+        </w:tc>
+      </w:tr>
+      <w:tr>
+        <w:tc>
+          <w:tcPr>
+            <w:tcW w:w="4148" w:type="dxa"/>
+          </w:tcPr>
+          <w:p>
+            <w:pPr>
+              <w:widowControl/>
+              <w:jc w:val="center"/>
+              <w:rPr>
+                <w:rFonts w:hint="eastAsia"/>
+                <w:noProof/>
+              </w:rPr>
+            </w:pPr>
+            <w:r>
+              <w:rPr>
+                <w:rFonts w:hint="eastAsia"/>
+              </w:rPr>
+              <w:t>圖十一</w:t>
+            </w:r>
+            <w:r>
+              <w:rPr>
+                <w:rFonts w:hint="eastAsia"/>
+              </w:rPr>
+              <w:t>：</w:t>
+            </w:r>
+            <w:r>
+              <w:rPr>
+                <w:rFonts w:hint="eastAsia"/>
+              </w:rPr>
+              <w:t>偏移量</w:t>
+            </w:r>
+            <m:oMath>
+              <m:sSup>
+                <m:sSupPr>
+                  <m:ctrlPr>
+                    <w:rPr>
+                      <w:rFonts w:ascii="Cambria Math" w:hAnsi="Cambria Math"/>
+                      <w:i/>
+                    </w:rPr>
+                  </m:ctrlPr>
+                </m:sSupPr>
+                <m:e>
+                  <m:r>
+                    <w:rPr>
+                      <w:rFonts w:ascii="Cambria Math" w:hAnsi="Cambria Math" w:hint="eastAsia"/>
+                    </w:rPr>
+                    <m:t>10</m:t>
+                  </m:r>
+                </m:e>
+                <m:sup>
+                  <m:r>
+                    <w:rPr>
+                      <w:rFonts w:ascii="MS Gothic" w:eastAsia="MS Gothic" w:hAnsi="MS Gothic" w:cs="MS Gothic" w:hint="eastAsia"/>
+                    </w:rPr>
+                    <m:t>-</m:t>
+                  </m:r>
+                  <m:r>
+                    <w:rPr>
+                      <w:rFonts w:ascii="Cambria Math" w:hAnsi="Cambria Math" w:hint="eastAsia"/>
+                    </w:rPr>
+                    <m:t>6</m:t>
+                  </m:r>
+                </m:sup>
+              </m:sSup>
+            </m:oMath>
+            <w:r>
+              <w:rPr>
+                <w:rFonts w:hint="eastAsia"/>
+              </w:rPr>
+              <w:t>的</w:t>
+            </w:r>
+            <w:r>
+              <w:rPr>
+                <w:rFonts w:hint="eastAsia"/>
+              </w:rPr>
+              <w:t>2-</w:t>
+            </w:r>
+            <w:r>
+              <w:t>norm</w:t>
+            </w:r>
+          </w:p>
+        </w:tc>
+        <w:tc>
+          <w:tcPr>
+            <w:tcW w:w="4148" w:type="dxa"/>
+          </w:tcPr>
+          <w:p>
+            <w:pPr>
+              <w:widowControl/>
+              <w:jc w:val="center"/>
+              <w:rPr>
+                <w:rFonts w:hint="eastAsia"/>
+                <w:noProof/>
+              </w:rPr>
+            </w:pPr>
+            <w:r>
+              <w:rPr>
+                <w:rFonts w:hint="eastAsia"/>
+              </w:rPr>
+              <w:t>圖十二</w:t>
+            </w:r>
+            <w:r>
+              <w:rPr>
+                <w:rFonts w:hint="eastAsia"/>
+              </w:rPr>
+              <w:t>：</w:t>
+            </w:r>
+            <w:r>
+              <w:rPr>
+                <w:rFonts w:hint="eastAsia"/>
+              </w:rPr>
+              <w:t>偏移量</w:t>
+            </w:r>
+            <m:oMath>
+              <m:sSup>
+                <m:sSupPr>
+                  <m:ctrlPr>
+                    <w:rPr>
+                      <w:rFonts w:ascii="Cambria Math" w:hAnsi="Cambria Math"/>
+                      <w:i/>
+                    </w:rPr>
+                  </m:ctrlPr>
+                </m:sSupPr>
+                <m:e>
+                  <m:r>
+                    <w:rPr>
+                      <w:rFonts w:ascii="Cambria Math" w:hAnsi="Cambria Math" w:hint="eastAsia"/>
+                    </w:rPr>
+                    <m:t>10</m:t>
+                  </m:r>
+                </m:e>
+                <m:sup>
+                  <m:r>
+                    <w:rPr>
+                      <w:rFonts w:ascii="MS Gothic" w:eastAsia="MS Gothic" w:hAnsi="MS Gothic" w:cs="MS Gothic" w:hint="eastAsia"/>
+                    </w:rPr>
+                    <m:t>-</m:t>
+                  </m:r>
+                  <m:r>
+                    <w:rPr>
+                      <w:rFonts w:ascii="Cambria Math" w:hAnsi="Cambria Math" w:hint="eastAsia"/>
+                    </w:rPr>
+                    <m:t>6</m:t>
+                  </m:r>
+                </m:sup>
+              </m:sSup>
+            </m:oMath>
+            <w:r>
+              <w:rPr>
+                <w:rFonts w:hint="eastAsia"/>
+              </w:rPr>
+              <w:t>的</w:t>
+            </w:r>
+            <w:r>
+              <w:rPr>
+                <w:rFonts w:hint="eastAsia"/>
+              </w:rPr>
+              <w:t>i</w:t>
+            </w:r>
+            <w:r>
+              <w:t>nfinite-norm</w:t>
+            </w:r>
+          </w:p>
+        </w:tc>
+      </w:tr>
+      <w:tr>
+        <w:tc>
+          <w:tcPr>
+            <w:tcW w:w="4148" w:type="dxa"/>
+          </w:tcPr>
+          <w:p>
+            <w:pPr>
+              <w:widowControl/>
+              <w:rPr>
+                <w:rFonts w:hint="eastAsia"/>
+              </w:rPr>
+            </w:pPr>
+            <w:r>
+              <w:rPr>
+                <w:rFonts w:hint="eastAsia"/>
+                <w:noProof/>
+              </w:rPr>
+              <w:drawing>
+                <wp:inline distT="0" distB="0" distL="0" distR="0" wp14:anchorId="15B5B13F" wp14:editId="203821CB">
+                  <wp:extent cx="2566453" cy="1926000"/>
+                  <wp:effectExtent l="0" t="0" r="5715" b="8255"/>
+                  <wp:docPr id="8" name="圖片 8"/>
+                  <wp:cNvGraphicFramePr>
+                    <a:graphicFrameLocks xmlns:a="http://schemas.openxmlformats.org/drawingml/2006/main" noChangeAspect="1"/>
+                  </wp:cNvGraphicFramePr>
+                  <a:graphic xmlns:a="http://schemas.openxmlformats.org/drawingml/2006/main">
+                    <a:graphicData uri="http://schemas.openxmlformats.org/drawingml/2006/picture">
+                      <pic:pic xmlns:pic="http://schemas.openxmlformats.org/drawingml/2006/picture">
+                        <pic:nvPicPr>
+                          <pic:cNvPr id="0" name="Picture 6"/>
+                          <pic:cNvPicPr>
+                            <a:picLocks noChangeAspect="1" noChangeArrowheads="1"/>
+                          </pic:cNvPicPr>
+                        </pic:nvPicPr>
+                        <pic:blipFill>
+                          <a:blip r:embed="rId27" cstate="print">
+                            <a:extLst>
+                              <a:ext uri="{28A0092B-C50C-407E-A947-70E740481C1C}">
+                                <a14:useLocalDpi xmlns:a14="http://schemas.microsoft.com/office/drawing/2010/main" val="0"/>
+                              </a:ext>
+                            </a:extLst>
+                          </a:blip>
+                          <a:srcRect/>
+                          <a:stretch>
+                            <a:fillRect/>
+                          </a:stretch>
+                        </pic:blipFill>
+                        <pic:spPr bwMode="auto">
+                          <a:xfrm>
+                            <a:off x="0" y="0"/>
+                            <a:ext cx="2566453" cy="1926000"/>
+                          </a:xfrm>
+                          <a:prstGeom prst="rect">
+                            <a:avLst/>
+                          </a:prstGeom>
+                          <a:noFill/>
+                          <a:ln>
+                            <a:noFill/>
+                          </a:ln>
+                        </pic:spPr>
+                      </pic:pic>
+                    </a:graphicData>
+                  </a:graphic>
+                </wp:inline>
+              </w:drawing>
+            </w:r>
+          </w:p>
+        </w:tc>
+        <w:tc>
+          <w:tcPr>
+            <w:tcW w:w="4148" w:type="dxa"/>
+          </w:tcPr>
+          <w:p>
+            <w:pPr>
+              <w:widowControl/>
+              <w:rPr>
+                <w:rFonts w:hint="eastAsia"/>
+              </w:rPr>
+            </w:pPr>
+            <w:r>
+              <w:rPr>
+                <w:rFonts w:hint="eastAsia"/>
+                <w:noProof/>
+              </w:rPr>
+              <w:drawing>
+                <wp:inline distT="0" distB="0" distL="0" distR="0" wp14:anchorId="3363DD12" wp14:editId="54F8A2F7">
+                  <wp:extent cx="2566453" cy="1926000"/>
+                  <wp:effectExtent l="0" t="0" r="5715" b="0"/>
+                  <wp:docPr id="9" name="圖片 9"/>
+                  <wp:cNvGraphicFramePr>
+                    <a:graphicFrameLocks xmlns:a="http://schemas.openxmlformats.org/drawingml/2006/main" noChangeAspect="1"/>
+                  </wp:cNvGraphicFramePr>
+                  <a:graphic xmlns:a="http://schemas.openxmlformats.org/drawingml/2006/main">
+                    <a:graphicData uri="http://schemas.openxmlformats.org/drawingml/2006/picture">
+                      <pic:pic xmlns:pic="http://schemas.openxmlformats.org/drawingml/2006/picture">
+                        <pic:nvPicPr>
+                          <pic:cNvPr id="0" name="Picture 7"/>
+                          <pic:cNvPicPr>
+                            <a:picLocks noChangeAspect="1" noChangeArrowheads="1"/>
+                          </pic:cNvPicPr>
+                        </pic:nvPicPr>
+                        <pic:blipFill>
+                          <a:blip r:embed="rId28" cstate="print">
+                            <a:extLst>
+                              <a:ext uri="{28A0092B-C50C-407E-A947-70E740481C1C}">
+                                <a14:useLocalDpi xmlns:a14="http://schemas.microsoft.com/office/drawing/2010/main" val="0"/>
+                              </a:ext>
+                            </a:extLst>
+                          </a:blip>
+                          <a:srcRect/>
+                          <a:stretch>
+                            <a:fillRect/>
+                          </a:stretch>
+                        </pic:blipFill>
+                        <pic:spPr bwMode="auto">
+                          <a:xfrm>
+                            <a:off x="0" y="0"/>
+                            <a:ext cx="2566453" cy="1926000"/>
+                          </a:xfrm>
+                          <a:prstGeom prst="rect">
+                            <a:avLst/>
+                          </a:prstGeom>
+                          <a:noFill/>
+                          <a:ln>
+                            <a:noFill/>
+                          </a:ln>
+                        </pic:spPr>
+                      </pic:pic>
+                    </a:graphicData>
+                  </a:graphic>
+                </wp:inline>
+              </w:drawing>
+            </w:r>
+          </w:p>
+        </w:tc>
+      </w:tr>
+      <w:tr>
+        <w:tc>
+          <w:tcPr>
+            <w:tcW w:w="4148" w:type="dxa"/>
+          </w:tcPr>
+          <w:p>
+            <w:pPr>
+              <w:widowControl/>
+              <w:jc w:val="center"/>
+              <w:rPr>
+                <w:rFonts w:hint="eastAsia"/>
+              </w:rPr>
+            </w:pPr>
+            <w:r>
+              <w:rPr>
+                <w:rFonts w:hint="eastAsia"/>
+              </w:rPr>
+              <w:t>圖十三</w:t>
+            </w:r>
+            <w:r>
+              <w:rPr>
+                <w:rFonts w:hint="eastAsia"/>
+              </w:rPr>
+              <w:t>：</w:t>
+            </w:r>
+            <w:r>
+              <w:rPr>
+                <w:rFonts w:hint="eastAsia"/>
+              </w:rPr>
+              <w:t>偏移量</w:t>
+            </w:r>
+            <w:r>
+              <w:rPr>
+                <w:rFonts w:hint="eastAsia"/>
+              </w:rPr>
+              <w:t>0.1</w:t>
+            </w:r>
+            <w:r>
+              <w:rPr>
+                <w:rFonts w:hint="eastAsia"/>
+              </w:rPr>
+              <w:t>的</w:t>
+            </w:r>
+            <w:r>
+              <w:rPr>
+                <w:rFonts w:hint="eastAsia"/>
+              </w:rPr>
+              <w:t>2-n</w:t>
+            </w:r>
+            <w:r>
+              <w:t>orm</w:t>
+            </w:r>
+          </w:p>
+        </w:tc>
+        <w:tc>
+          <w:tcPr>
+            <w:tcW w:w="4148" w:type="dxa"/>
+          </w:tcPr>
+          <w:p>
+            <w:pPr>
+              <w:widowControl/>
+              <w:jc w:val="center"/>
+              <w:rPr>
+                <w:rFonts w:hint="eastAsia"/>
+              </w:rPr>
+            </w:pPr>
+            <w:r>
+              <w:rPr>
+                <w:rFonts w:hint="eastAsia"/>
+              </w:rPr>
+              <w:t>圖十四</w:t>
+            </w:r>
+            <w:r>
+              <w:rPr>
+                <w:rFonts w:hint="eastAsia"/>
+              </w:rPr>
+              <w:t>：</w:t>
+            </w:r>
+            <w:r>
+              <w:rPr>
+                <w:rFonts w:hint="eastAsia"/>
+              </w:rPr>
+              <w:t>偏移量</w:t>
+            </w:r>
+            <w:r>
+              <w:rPr>
+                <w:rFonts w:hint="eastAsia"/>
+              </w:rPr>
+              <w:t>0.1</w:t>
+            </w:r>
+            <w:r>
+              <w:rPr>
+                <w:rFonts w:hint="eastAsia"/>
+              </w:rPr>
+              <w:t>的</w:t>
+            </w:r>
+            <w:r>
+              <w:rPr>
+                <w:rFonts w:hint="eastAsia"/>
+              </w:rPr>
+              <w:t>i</w:t>
+            </w:r>
+            <w:r>
+              <w:t>nfinite-norm</w:t>
+            </w:r>
+          </w:p>
+        </w:tc>
+      </w:tr>
+    </w:tbl>
+    <w:p>
+      <w:pPr>
+        <w:widowControl/>
+      </w:pPr>
+      <w:r>
+        <w:tab/>
+      </w:r>
     </w:p>
     <w:p>
       <w:pPr>
         <w:widowControl/>
-      </w:pPr>
-      <w:r>
-        <w:br w:type="page"/>
+        <w:rPr>
+          <w:rFonts w:hint="eastAsia"/>
+        </w:rPr>
+      </w:pPr>
+      <w:r>
+        <w:tab/>
+      </w:r>
+      <w:r>
+        <w:rPr>
+          <w:rFonts w:hint="eastAsia"/>
+        </w:rPr>
+        <w:t>上圖可</w:t>
+      </w:r>
+      <w:r>
+        <w:rPr>
+          <w:rFonts w:hint="eastAsia"/>
+        </w:rPr>
+        <w:t>看出誤差值跟取樣點位置有關，</w:t>
+      </w:r>
+      <w:r>
+        <w:rPr>
+          <w:rFonts w:hint="eastAsia"/>
+        </w:rPr>
+        <w:t>取樣點</w:t>
+      </w:r>
+      <w:r>
+        <w:rPr>
+          <w:rFonts w:hint="eastAsia"/>
+        </w:rPr>
+        <w:t>好壞</w:t>
+      </w:r>
+      <w:r>
+        <w:rPr>
+          <w:rFonts w:hint="eastAsia"/>
+        </w:rPr>
+        <w:t>也會影響誤差的收斂。</w:t>
       </w:r>
     </w:p>
     <w:p>
@@ -2212,7 +2904,6 @@
         <w:rPr>
           <w:rFonts w:hint="eastAsia"/>
         </w:rPr>
-        <w:lastRenderedPageBreak/>
         <w:t>心得</w:t>
       </w:r>
     </w:p>
@@ -2362,7 +3053,6 @@
         </w:rPr>
         <w:t>程式部分除了線性系統的實作外，資料的紀錄也同樣有難度，最後還要將這些資料視覺化，因此光是資料的編排就費了不少努力，接著還要判斷甚麼時候存甚麼樣的資料，以及如何使用</w:t>
       </w:r>
-      <w:proofErr w:type="spellStart"/>
       <w:r>
         <w:rPr>
           <w:rFonts w:hint="eastAsia"/>
@@ -2372,7 +3062,6 @@
       <w:r>
         <w:t>nuplot</w:t>
       </w:r>
-      <w:proofErr w:type="spellEnd"/>
       <w:r>
         <w:rPr>
           <w:rFonts w:hint="eastAsia"/>
@@ -3073,6 +3762,16 @@
       </w:tblBorders>
     </w:tblPr>
   </w:style>
+  <w:style w:type="character" w:styleId="a5">
+    <w:name w:val="Placeholder Text"/>
+    <w:basedOn w:val="a0"/>
+    <w:uiPriority w:val="99"/>
+    <w:semiHidden/>
+    <w:rsid w:val="006275F6"/>
+    <w:rPr>
+      <w:color w:val="808080"/>
+    </w:rPr>
+  </w:style>
 </w:styles>
 </file>
 

</xml_diff>